<commit_message>
Update skills and docs
</commit_message>
<xml_diff>
--- a/docs/Guide_Shared_Claude_Skills_Git_Hooks_v2.docx
+++ b/docs/Guide_Shared_Claude_Skills_Git_Hooks_v2.docx
@@ -45,7 +45,7 @@
           <w:sz w:val="18"/>
           <w:szCs w:val="18"/>
         </w:rPr>
-        <w:t xml:space="preserve">Cập nhật 27/10/2026</w:t>
+        <w:t xml:space="preserve">Cập nhật 31/10/2026</w:t>
       </w:r>
     </w:p>
     <w:p>
@@ -187,7 +187,7 @@
             <w:bCs w:val="false"/>
             <w:color w:val="404040"/>
           </w:rPr>
-          <w:t xml:space="preserve">3.3. Đồng bộ lần đầu</w:t>
+          <w:t xml:space="preserve">3.3. Đồng bộ lần đầu (chỉ khi clone theo cách B)</w:t>
         </w:r>
       </w:hyperlink>
     </w:p>
@@ -705,7 +705,19 @@
         <w:t xml:space="preserve">sync-skills.ps1</w:t>
       </w:r>
       <w:r>
-        <w:t xml:space="preserve">. Việc này được tự động hóa bằng Git hook (khi pull) và watcher (khi sửa Skill tại máy).</w:t>
+        <w:t xml:space="preserve">. Việc này được tự động hóa bằng Git hook (khi clone có </w:t>
+      </w:r>
+      <w:r>
+        <w:rPr>
+          <w:rFonts w:ascii="Consolas" w:cs="Consolas" w:eastAsia="Consolas" w:hAnsi="Consolas"/>
+          <w:color w:val="7A2E0E"/>
+          <w:sz w:val="19"/>
+          <w:szCs w:val="19"/>
+        </w:rPr>
+        <w:t xml:space="preserve">-c core.hooksPath=.githooks</w:t>
+      </w:r>
+      <w:r>
+        <w:t xml:space="preserve"> và khi pull có commit mới) và watcher (khi sửa Skill tại máy).</w:t>
       </w:r>
     </w:p>
     <w:p>
@@ -1381,19 +1393,7 @@
           </w:tcPr>
           <w:p>
             <w:r>
-              <w:t xml:space="preserve">Hook </w:t>
-            </w:r>
-            <w:r>
-              <w:rPr>
-                <w:rFonts w:ascii="Consolas" w:cs="Consolas" w:eastAsia="Consolas" w:hAnsi="Consolas"/>
-                <w:color w:val="7A2E0E"/>
-                <w:sz w:val="19"/>
-                <w:szCs w:val="19"/>
-              </w:rPr>
-              <w:t xml:space="preserve">post-rewrite</w:t>
-            </w:r>
-            <w:r>
-              <w:t xml:space="preserve"> gọi sync</w:t>
+              <w:t xml:space="preserve">Có commit local chưa push: hook post-rewrite gọi sync. Không có commit local: Git fast-forward, hook post-merge gọi sync</w:t>
             </w:r>
           </w:p>
         </w:tc>
@@ -1643,7 +1643,7 @@
           </w:tcPr>
           <w:p>
             <w:r>
-              <w:t xml:space="preserve">git checkout / git switch nhánh khác</w:t>
+              <w:t xml:space="preserve">git pull báo Already up to date</w:t>
             </w:r>
           </w:p>
         </w:tc>
@@ -1665,7 +1665,7 @@
           </w:tcPr>
           <w:p>
             <w:r>
-              <w:t xml:space="preserve">Không có hook</w:t>
+              <w:t xml:space="preserve">Không có commit mới nên Git không chạy hook</w:t>
             </w:r>
           </w:p>
         </w:tc>
@@ -1687,7 +1687,7 @@
           </w:tcPr>
           <w:p>
             <w:r>
-              <w:t xml:space="preserve">Chạy sync thủ công nếu nhánh có Skill hoặc template khác</w:t>
+              <w:t xml:space="preserve">Không — không có gì cần đồng bộ</w:t>
             </w:r>
           </w:p>
         </w:tc>
@@ -1711,7 +1711,7 @@
           </w:tcPr>
           <w:p>
             <w:r>
-              <w:t xml:space="preserve">git clone lần đầu</w:t>
+              <w:t xml:space="preserve">git checkout / git switch nhánh khác</w:t>
             </w:r>
           </w:p>
         </w:tc>
@@ -1733,6 +1733,142 @@
           </w:tcPr>
           <w:p>
             <w:r>
+              <w:t xml:space="preserve">Hook post-checkout có chạy nhưng bỏ qua (chỉ sync khi clone)</w:t>
+            </w:r>
+          </w:p>
+        </w:tc>
+        <w:tc>
+          <w:tcPr>
+            <w:tcW w:type="dxa" w:w="2892"/>
+            <w:tcBorders>
+              <w:top w:val="single" w:color="BFBFBF" w:sz="4"/>
+              <w:left w:val="single" w:color="BFBFBF" w:sz="4"/>
+              <w:bottom w:val="single" w:color="BFBFBF" w:sz="4"/>
+              <w:right w:val="single" w:color="BFBFBF" w:sz="4"/>
+            </w:tcBorders>
+            <w:tcMar>
+              <w:top w:type="dxa" w:w="60"/>
+              <w:left w:type="dxa" w:w="100"/>
+              <w:bottom w:type="dxa" w:w="60"/>
+              <w:right w:type="dxa" w:w="100"/>
+            </w:tcMar>
+          </w:tcPr>
+          <w:p>
+            <w:r>
+              <w:t xml:space="preserve">Chạy sync thủ công nếu nhánh có Skill hoặc template khác</w:t>
+            </w:r>
+          </w:p>
+        </w:tc>
+      </w:tr>
+      <w:tr>
+        <w:tc>
+          <w:tcPr>
+            <w:tcW w:type="dxa" w:w="3180"/>
+            <w:tcBorders>
+              <w:top w:val="single" w:color="BFBFBF" w:sz="4"/>
+              <w:left w:val="single" w:color="BFBFBF" w:sz="4"/>
+              <w:bottom w:val="single" w:color="BFBFBF" w:sz="4"/>
+              <w:right w:val="single" w:color="BFBFBF" w:sz="4"/>
+            </w:tcBorders>
+            <w:tcMar>
+              <w:top w:type="dxa" w:w="60"/>
+              <w:left w:type="dxa" w:w="100"/>
+              <w:bottom w:type="dxa" w:w="60"/>
+              <w:right w:type="dxa" w:w="100"/>
+            </w:tcMar>
+          </w:tcPr>
+          <w:p>
+            <w:r>
+              <w:t xml:space="preserve">git clone -c core.hooksPath=.githooks (khuyến nghị)</w:t>
+            </w:r>
+          </w:p>
+        </w:tc>
+        <w:tc>
+          <w:tcPr>
+            <w:tcW w:type="dxa" w:w="3566"/>
+            <w:tcBorders>
+              <w:top w:val="single" w:color="BFBFBF" w:sz="4"/>
+              <w:left w:val="single" w:color="BFBFBF" w:sz="4"/>
+              <w:bottom w:val="single" w:color="BFBFBF" w:sz="4"/>
+              <w:right w:val="single" w:color="BFBFBF" w:sz="4"/>
+            </w:tcBorders>
+            <w:tcMar>
+              <w:top w:type="dxa" w:w="60"/>
+              <w:left w:type="dxa" w:w="100"/>
+              <w:bottom w:type="dxa" w:w="60"/>
+              <w:right w:type="dxa" w:w="100"/>
+            </w:tcMar>
+          </w:tcPr>
+          <w:p>
+            <w:r>
+              <w:t xml:space="preserve">Hook post-checkout gọi sync ở cuối lệnh clone</w:t>
+            </w:r>
+          </w:p>
+        </w:tc>
+        <w:tc>
+          <w:tcPr>
+            <w:tcW w:type="dxa" w:w="2892"/>
+            <w:tcBorders>
+              <w:top w:val="single" w:color="BFBFBF" w:sz="4"/>
+              <w:left w:val="single" w:color="BFBFBF" w:sz="4"/>
+              <w:bottom w:val="single" w:color="BFBFBF" w:sz="4"/>
+              <w:right w:val="single" w:color="BFBFBF" w:sz="4"/>
+            </w:tcBorders>
+            <w:tcMar>
+              <w:top w:type="dxa" w:w="60"/>
+              <w:left w:type="dxa" w:w="100"/>
+              <w:bottom w:type="dxa" w:w="60"/>
+              <w:right w:type="dxa" w:w="100"/>
+            </w:tcMar>
+          </w:tcPr>
+          <w:p>
+            <w:r>
+              <w:t xml:space="preserve">Không</w:t>
+            </w:r>
+          </w:p>
+        </w:tc>
+      </w:tr>
+      <w:tr>
+        <w:tc>
+          <w:tcPr>
+            <w:tcW w:type="dxa" w:w="3180"/>
+            <w:tcBorders>
+              <w:top w:val="single" w:color="BFBFBF" w:sz="4"/>
+              <w:left w:val="single" w:color="BFBFBF" w:sz="4"/>
+              <w:bottom w:val="single" w:color="BFBFBF" w:sz="4"/>
+              <w:right w:val="single" w:color="BFBFBF" w:sz="4"/>
+            </w:tcBorders>
+            <w:tcMar>
+              <w:top w:type="dxa" w:w="60"/>
+              <w:left w:type="dxa" w:w="100"/>
+              <w:bottom w:type="dxa" w:w="60"/>
+              <w:right w:type="dxa" w:w="100"/>
+            </w:tcMar>
+          </w:tcPr>
+          <w:p>
+            <w:r>
+              <w:t xml:space="preserve">git clone thường (không có -c)</w:t>
+            </w:r>
+          </w:p>
+        </w:tc>
+        <w:tc>
+          <w:tcPr>
+            <w:tcW w:type="dxa" w:w="3566"/>
+            <w:tcBorders>
+              <w:top w:val="single" w:color="BFBFBF" w:sz="4"/>
+              <w:left w:val="single" w:color="BFBFBF" w:sz="4"/>
+              <w:bottom w:val="single" w:color="BFBFBF" w:sz="4"/>
+              <w:right w:val="single" w:color="BFBFBF" w:sz="4"/>
+            </w:tcBorders>
+            <w:tcMar>
+              <w:top w:type="dxa" w:w="60"/>
+              <w:left w:type="dxa" w:w="100"/>
+              <w:bottom w:type="dxa" w:w="60"/>
+              <w:right w:type="dxa" w:w="100"/>
+            </w:tcMar>
+          </w:tcPr>
+          <w:p>
+            <w:r>
               <w:t xml:space="preserve">Hook chưa được bật</w:t>
             </w:r>
           </w:p>
@@ -1755,7 +1891,7 @@
           </w:tcPr>
           <w:p>
             <w:r>
-              <w:t xml:space="preserve">Làm theo phần 3</w:t>
+              <w:t xml:space="preserve">Bật hook và chạy sync thủ công (mục 3.2 cách B, mục 3.3)</w:t>
             </w:r>
           </w:p>
         </w:tc>
@@ -1828,6 +1964,24 @@
           <w:sz w:val="18"/>
           <w:szCs w:val="18"/>
         </w:rPr>
+        <w:t xml:space="preserve">│   ├── post-checkout              # chạy cuối git clone (khi clone có -c core.hooksPath)</w:t>
+      </w:r>
+    </w:p>
+    <w:p>
+      <w:pPr>
+        <w:pBdr>
+          <w:left w:val="single" w:color="9CA3AF" w:sz="12" w:space="6"/>
+        </w:pBdr>
+        <w:shd w:fill="F3F4F6" w:color="auto" w:val="clear"/>
+        <w:spacing w:before="0" w:after="0" w:line="260"/>
+        <w:ind w:left="170"/>
+      </w:pPr>
+      <w:r>
+        <w:rPr>
+          <w:rFonts w:ascii="Consolas" w:cs="Consolas" w:eastAsia="Consolas" w:hAnsi="Consolas"/>
+          <w:sz w:val="18"/>
+          <w:szCs w:val="18"/>
+        </w:rPr>
         <w:t xml:space="preserve">│   ├── post-merge                 # chạy sau pull merge / fast-forward</w:t>
       </w:r>
     </w:p>
@@ -1864,6 +2018,24 @@
           <w:sz w:val="18"/>
           <w:szCs w:val="18"/>
         </w:rPr>
+        <w:t xml:space="preserve">├── .gitattributes                 # giữ file hook ở dạng xuống dòng LF</w:t>
+      </w:r>
+    </w:p>
+    <w:p>
+      <w:pPr>
+        <w:pBdr>
+          <w:left w:val="single" w:color="9CA3AF" w:sz="12" w:space="6"/>
+        </w:pBdr>
+        <w:shd w:fill="F3F4F6" w:color="auto" w:val="clear"/>
+        <w:spacing w:before="0" w:after="0" w:line="260"/>
+        <w:ind w:left="170"/>
+      </w:pPr>
+      <w:r>
+        <w:rPr>
+          <w:rFonts w:ascii="Consolas" w:cs="Consolas" w:eastAsia="Consolas" w:hAnsi="Consolas"/>
+          <w:sz w:val="18"/>
+          <w:szCs w:val="18"/>
+        </w:rPr>
         <w:t xml:space="preserve">├── scripts/</w:t>
       </w:r>
     </w:p>
@@ -2224,7 +2396,7 @@
           <w:sz w:val="18"/>
           <w:szCs w:val="18"/>
         </w:rPr>
-        <w:t xml:space="preserve">│   │   └── html-injection-xss.md</w:t>
+        <w:t xml:space="preserve">│   │   ├── html-injection-xss.md</w:t>
       </w:r>
     </w:p>
     <w:p>
@@ -2242,7 +2414,7 @@
           <w:sz w:val="18"/>
           <w:szCs w:val="18"/>
         </w:rPr>
-        <w:t xml:space="preserve">│   └── bug-fixing/  performance/  feature-development/</w:t>
+        <w:t xml:space="preserve">│   │   └── rate-limiting.md</w:t>
       </w:r>
     </w:p>
     <w:p>
@@ -2260,6 +2432,24 @@
           <w:sz w:val="18"/>
           <w:szCs w:val="18"/>
         </w:rPr>
+        <w:t xml:space="preserve">│   └── bug-fixing/  performance/  feature-development/   # chưa có Rule (mục 8)</w:t>
+      </w:r>
+    </w:p>
+    <w:p>
+      <w:pPr>
+        <w:pBdr>
+          <w:left w:val="single" w:color="9CA3AF" w:sz="12" w:space="6"/>
+        </w:pBdr>
+        <w:shd w:fill="F3F4F6" w:color="auto" w:val="clear"/>
+        <w:spacing w:before="0" w:after="0" w:line="260"/>
+        <w:ind w:left="170"/>
+      </w:pPr>
+      <w:r>
+        <w:rPr>
+          <w:rFonts w:ascii="Consolas" w:cs="Consolas" w:eastAsia="Consolas" w:hAnsi="Consolas"/>
+          <w:sz w:val="18"/>
+          <w:szCs w:val="18"/>
+        </w:rPr>
         <w:t xml:space="preserve">├── knowledge/                     # kho bài học dùng chung (mục 6)</w:t>
       </w:r>
     </w:p>
@@ -2314,7 +2504,7 @@
           <w:sz w:val="18"/>
           <w:szCs w:val="18"/>
         </w:rPr>
-        <w:t xml:space="preserve">│   ├── common/</w:t>
+        <w:t xml:space="preserve">│   ├── common/                    # bài học dùng chung mọi project</w:t>
       </w:r>
     </w:p>
     <w:p>
@@ -2356,6 +2546,24 @@
     <w:p>
       <w:pPr>
         <w:pBdr>
+          <w:left w:val="single" w:color="9CA3AF" w:sz="12" w:space="6"/>
+        </w:pBdr>
+        <w:shd w:fill="F3F4F6" w:color="auto" w:val="clear"/>
+        <w:spacing w:before="0" w:after="0" w:line="260"/>
+        <w:ind w:left="170"/>
+      </w:pPr>
+      <w:r>
+        <w:rPr>
+          <w:rFonts w:ascii="Consolas" w:cs="Consolas" w:eastAsia="Consolas" w:hAnsi="Consolas"/>
+          <w:sz w:val="18"/>
+          <w:szCs w:val="18"/>
+        </w:rPr>
+        <w:t xml:space="preserve">    ├── execution-flow.md          # luồng chạy khi gõ chat (mục 5)</w:t>
+      </w:r>
+    </w:p>
+    <w:p>
+      <w:pPr>
+        <w:pBdr>
           <w:bottom w:val="single" w:color="F3F4F6" w:sz="2" w:space="2"/>
           <w:left w:val="single" w:color="9CA3AF" w:sz="12" w:space="6"/>
         </w:pBdr>
@@ -2369,7 +2577,7 @@
           <w:sz w:val="18"/>
           <w:szCs w:val="18"/>
         </w:rPr>
-        <w:t xml:space="preserve">    └── execution-flow.md          # luồng chạy khi gõ chat (mục 5)</w:t>
+        <w:t xml:space="preserve">    └── Guide_Shared_Claude_Skills_Git_Hooks_v2.docx   # tài liệu này</w:t>
       </w:r>
     </w:p>
     <w:p>
@@ -2691,7 +2899,29 @@
         <w:spacing w:after="120"/>
       </w:pPr>
       <w:r>
-        <w:t xml:space="preserve">Mở PowerShell và chạy lần lượt (có thể clone vào thư mục bất kỳ; ví dụ dưới dùng đường dẫn chuẩn của team):</w:t>
+        <w:t xml:space="preserve">Có hai cách clone. Nên dùng </w:t>
+      </w:r>
+      <w:r>
+        <w:rPr>
+          <w:b/>
+          <w:bCs/>
+        </w:rPr>
+        <w:t xml:space="preserve">cách A</w:t>
+      </w:r>
+      <w:r>
+        <w:t xml:space="preserve">: một lệnh vừa clone, vừa bật hook, vừa đồng bộ lần đầu. Có thể clone vào thư mục bất kỳ; ví dụ dưới dùng đường dẫn chuẩn của team.</w:t>
+      </w:r>
+    </w:p>
+    <w:p>
+      <w:pPr>
+        <w:spacing w:after="120"/>
+      </w:pPr>
+      <w:r>
+        <w:rPr>
+          <w:b/>
+          <w:bCs/>
+        </w:rPr>
+        <w:t xml:space="preserve">Cách A (khuyến nghị): clone có tham số -c</w:t>
       </w:r>
     </w:p>
     <w:p>
@@ -2710,7 +2940,7 @@
           <w:sz w:val="18"/>
           <w:szCs w:val="18"/>
         </w:rPr>
-        <w:t xml:space="preserve"># 1. Clone</w:t>
+        <w:t xml:space="preserve"># Clone, bật hook và đồng bộ lần đầu trong một lệnh</w:t>
       </w:r>
     </w:p>
     <w:p>
@@ -2728,7 +2958,7 @@
           <w:sz w:val="18"/>
           <w:szCs w:val="18"/>
         </w:rPr>
-        <w:t xml:space="preserve">git clone https://github.com/phthuan/Cadena.AI-Engineering.git "D:\Source Project\Claude Skill\Cadena.AI-Engineering"</w:t>
+        <w:t xml:space="preserve">git clone -c core.hooksPath=.githooks https://github.com/phthuan/Cadena.AI-Engineering.git "D:\Source Project\Claude Skill\Cadena.AI-Engineering"</w:t>
       </w:r>
     </w:p>
     <w:p>
@@ -2752,60 +2982,6 @@
     <w:p>
       <w:pPr>
         <w:pBdr>
-          <w:left w:val="single" w:color="9CA3AF" w:sz="12" w:space="6"/>
-        </w:pBdr>
-        <w:shd w:fill="F3F4F6" w:color="auto" w:val="clear"/>
-        <w:spacing w:before="0" w:after="0" w:line="260"/>
-        <w:ind w:left="170"/>
-      </w:pPr>
-      <w:r>
-        <w:rPr>
-          <w:rFonts w:ascii="Consolas" w:cs="Consolas" w:eastAsia="Consolas" w:hAnsi="Consolas"/>
-          <w:sz w:val="18"/>
-          <w:szCs w:val="18"/>
-        </w:rPr>
-        <w:t xml:space="preserve"> </w:t>
-      </w:r>
-    </w:p>
-    <w:p>
-      <w:pPr>
-        <w:pBdr>
-          <w:left w:val="single" w:color="9CA3AF" w:sz="12" w:space="6"/>
-        </w:pBdr>
-        <w:shd w:fill="F3F4F6" w:color="auto" w:val="clear"/>
-        <w:spacing w:before="0" w:after="0" w:line="260"/>
-        <w:ind w:left="170"/>
-      </w:pPr>
-      <w:r>
-        <w:rPr>
-          <w:rFonts w:ascii="Consolas" w:cs="Consolas" w:eastAsia="Consolas" w:hAnsi="Consolas"/>
-          <w:sz w:val="18"/>
-          <w:szCs w:val="18"/>
-        </w:rPr>
-        <w:t xml:space="preserve"># 2. Bật Git hooks cho bản clone này</w:t>
-      </w:r>
-    </w:p>
-    <w:p>
-      <w:pPr>
-        <w:pBdr>
-          <w:left w:val="single" w:color="9CA3AF" w:sz="12" w:space="6"/>
-        </w:pBdr>
-        <w:shd w:fill="F3F4F6" w:color="auto" w:val="clear"/>
-        <w:spacing w:before="0" w:after="0" w:line="260"/>
-        <w:ind w:left="170"/>
-      </w:pPr>
-      <w:r>
-        <w:rPr>
-          <w:rFonts w:ascii="Consolas" w:cs="Consolas" w:eastAsia="Consolas" w:hAnsi="Consolas"/>
-          <w:sz w:val="18"/>
-          <w:szCs w:val="18"/>
-        </w:rPr>
-        <w:t xml:space="preserve">git config core.hooksPath .githooks</w:t>
-      </w:r>
-    </w:p>
-    <w:p>
-      <w:pPr>
-        <w:pBdr>
           <w:bottom w:val="single" w:color="F3F4F6" w:sz="2" w:space="2"/>
           <w:left w:val="single" w:color="9CA3AF" w:sz="12" w:space="6"/>
         </w:pBdr>
@@ -2820,6 +2996,86 @@
           <w:szCs w:val="18"/>
         </w:rPr>
         <w:t xml:space="preserve">git config --get core.hooksPath      # kết quả mong đợi: .githooks</w:t>
+      </w:r>
+    </w:p>
+    <w:p>
+      <w:pPr>
+        <w:spacing w:after="120"/>
+      </w:pPr>
+      <w:r>
+        <w:t xml:space="preserve">Tham số </w:t>
+      </w:r>
+      <w:r>
+        <w:rPr>
+          <w:rFonts w:ascii="Consolas" w:cs="Consolas" w:eastAsia="Consolas" w:hAnsi="Consolas"/>
+          <w:color w:val="7A2E0E"/>
+          <w:sz w:val="19"/>
+          <w:szCs w:val="19"/>
+        </w:rPr>
+        <w:t xml:space="preserve">-c core.hooksPath=.githooks</w:t>
+      </w:r>
+      <w:r>
+        <w:t xml:space="preserve"> ghi cấu hình hook vào bản clone ngay khi tạo, nên hook </w:t>
+      </w:r>
+      <w:r>
+        <w:rPr>
+          <w:rFonts w:ascii="Consolas" w:cs="Consolas" w:eastAsia="Consolas" w:hAnsi="Consolas"/>
+          <w:color w:val="7A2E0E"/>
+          <w:sz w:val="19"/>
+          <w:szCs w:val="19"/>
+        </w:rPr>
+        <w:t xml:space="preserve">post-checkout</w:t>
+      </w:r>
+      <w:r>
+        <w:t xml:space="preserve"> chạy ở cuối lệnh </w:t>
+      </w:r>
+      <w:r>
+        <w:rPr>
+          <w:rFonts w:ascii="Consolas" w:cs="Consolas" w:eastAsia="Consolas" w:hAnsi="Consolas"/>
+          <w:color w:val="7A2E0E"/>
+          <w:sz w:val="19"/>
+          <w:szCs w:val="19"/>
+        </w:rPr>
+        <w:t xml:space="preserve">git clone</w:t>
+      </w:r>
+      <w:r>
+        <w:t xml:space="preserve"> và gọi </w:t>
+      </w:r>
+      <w:r>
+        <w:rPr>
+          <w:rFonts w:ascii="Consolas" w:cs="Consolas" w:eastAsia="Consolas" w:hAnsi="Consolas"/>
+          <w:color w:val="7A2E0E"/>
+          <w:sz w:val="19"/>
+          <w:szCs w:val="19"/>
+        </w:rPr>
+        <w:t xml:space="preserve">sync-skills.ps1</w:t>
+      </w:r>
+      <w:r>
+        <w:t xml:space="preserve">. Kết quả mong đợi: cuối lệnh clone in một dòng </w:t>
+      </w:r>
+      <w:r>
+        <w:rPr>
+          <w:rFonts w:ascii="Consolas" w:cs="Consolas" w:eastAsia="Consolas" w:hAnsi="Consolas"/>
+          <w:color w:val="7A2E0E"/>
+          <w:sz w:val="19"/>
+          <w:szCs w:val="19"/>
+        </w:rPr>
+        <w:t xml:space="preserve">Da tao lien ket: &lt;tên&gt;</w:t>
+      </w:r>
+      <w:r>
+        <w:t xml:space="preserve"> cho mỗi Skill và dòng </w:t>
+      </w:r>
+      <w:r>
+        <w:rPr>
+          <w:rFonts w:ascii="Consolas" w:cs="Consolas" w:eastAsia="Consolas" w:hAnsi="Consolas"/>
+          <w:color w:val="7A2E0E"/>
+          <w:sz w:val="19"/>
+          <w:szCs w:val="19"/>
+        </w:rPr>
+        <w:t xml:space="preserve">Da cap nhat: ...\.claude\CLAUDE.md</w:t>
+      </w:r>
+      <w:r>
+        <w:t xml:space="preserve">. Không cần làm mục 3.3.</w:t>
       </w:r>
     </w:p>
     <w:p>
@@ -2840,6 +3096,147 @@
         <w:t xml:space="preserve">Lưu ý: </w:t>
       </w:r>
       <w:r>
+        <w:t xml:space="preserve">Copy nguyên lệnh, không bỏ </w:t>
+      </w:r>
+      <w:r>
+        <w:rPr>
+          <w:rFonts w:ascii="Consolas" w:cs="Consolas" w:eastAsia="Consolas" w:hAnsi="Consolas"/>
+          <w:color w:val="7A2E0E"/>
+          <w:sz w:val="19"/>
+          <w:szCs w:val="19"/>
+        </w:rPr>
+        <w:t xml:space="preserve">-c core.hooksPath=.githooks</w:t>
+      </w:r>
+      <w:r>
+        <w:t xml:space="preserve">. Git không cho repository tự bật hook khi clone (vì lý do bảo mật), nên tham số này chính là bước đăng ký hook. Thiếu nó thì không có hook nào chạy và không có gì được đồng bộ.</w:t>
+      </w:r>
+    </w:p>
+    <w:p>
+      <w:pPr>
+        <w:spacing w:after="120"/>
+      </w:pPr>
+      <w:r>
+        <w:rPr>
+          <w:b/>
+          <w:bCs/>
+        </w:rPr>
+        <w:t xml:space="preserve">Cách B: đã clone bằng lệnh thường, hoặc clone bằng TortoiseGit / VS Code</w:t>
+      </w:r>
+    </w:p>
+    <w:p>
+      <w:pPr>
+        <w:spacing w:after="120"/>
+      </w:pPr>
+      <w:r>
+        <w:t xml:space="preserve">Dùng khi bản clone chưa có </w:t>
+      </w:r>
+      <w:r>
+        <w:rPr>
+          <w:rFonts w:ascii="Consolas" w:cs="Consolas" w:eastAsia="Consolas" w:hAnsi="Consolas"/>
+          <w:color w:val="7A2E0E"/>
+          <w:sz w:val="19"/>
+          <w:szCs w:val="19"/>
+        </w:rPr>
+        <w:t xml:space="preserve">-c core.hooksPath=.githooks</w:t>
+      </w:r>
+      <w:r>
+        <w:t xml:space="preserve">, ví dụ clone bằng </w:t>
+      </w:r>
+      <w:r>
+        <w:rPr>
+          <w:rFonts w:ascii="Consolas" w:cs="Consolas" w:eastAsia="Consolas" w:hAnsi="Consolas"/>
+          <w:color w:val="7A2E0E"/>
+          <w:sz w:val="19"/>
+          <w:szCs w:val="19"/>
+        </w:rPr>
+        <w:t xml:space="preserve">git clone &lt;url&gt;</w:t>
+      </w:r>
+      <w:r>
+        <w:t xml:space="preserve"> hoặc bằng hộp thoại Clone của công cụ. Chạy trong thư mục repository:</w:t>
+      </w:r>
+    </w:p>
+    <w:p>
+      <w:pPr>
+        <w:pBdr>
+          <w:top w:val="single" w:color="F3F4F6" w:sz="2" w:space="2"/>
+          <w:left w:val="single" w:color="9CA3AF" w:sz="12" w:space="6"/>
+        </w:pBdr>
+        <w:shd w:fill="F3F4F6" w:color="auto" w:val="clear"/>
+        <w:spacing w:before="0" w:after="0" w:line="260"/>
+        <w:ind w:left="170"/>
+      </w:pPr>
+      <w:r>
+        <w:rPr>
+          <w:rFonts w:ascii="Consolas" w:cs="Consolas" w:eastAsia="Consolas" w:hAnsi="Consolas"/>
+          <w:sz w:val="18"/>
+          <w:szCs w:val="18"/>
+        </w:rPr>
+        <w:t xml:space="preserve"># Bật Git hooks cho bản clone này</w:t>
+      </w:r>
+    </w:p>
+    <w:p>
+      <w:pPr>
+        <w:pBdr>
+          <w:left w:val="single" w:color="9CA3AF" w:sz="12" w:space="6"/>
+        </w:pBdr>
+        <w:shd w:fill="F3F4F6" w:color="auto" w:val="clear"/>
+        <w:spacing w:before="0" w:after="0" w:line="260"/>
+        <w:ind w:left="170"/>
+      </w:pPr>
+      <w:r>
+        <w:rPr>
+          <w:rFonts w:ascii="Consolas" w:cs="Consolas" w:eastAsia="Consolas" w:hAnsi="Consolas"/>
+          <w:sz w:val="18"/>
+          <w:szCs w:val="18"/>
+        </w:rPr>
+        <w:t xml:space="preserve">git config core.hooksPath .githooks</w:t>
+      </w:r>
+    </w:p>
+    <w:p>
+      <w:pPr>
+        <w:pBdr>
+          <w:bottom w:val="single" w:color="F3F4F6" w:sz="2" w:space="2"/>
+          <w:left w:val="single" w:color="9CA3AF" w:sz="12" w:space="6"/>
+        </w:pBdr>
+        <w:shd w:fill="F3F4F6" w:color="auto" w:val="clear"/>
+        <w:spacing w:before="0" w:after="160" w:line="260"/>
+        <w:ind w:left="170"/>
+      </w:pPr>
+      <w:r>
+        <w:rPr>
+          <w:rFonts w:ascii="Consolas" w:cs="Consolas" w:eastAsia="Consolas" w:hAnsi="Consolas"/>
+          <w:sz w:val="18"/>
+          <w:szCs w:val="18"/>
+        </w:rPr>
+        <w:t xml:space="preserve">git config --get core.hooksPath      # kết quả mong đợi: .githooks</w:t>
+      </w:r>
+    </w:p>
+    <w:p>
+      <w:pPr>
+        <w:spacing w:after="120"/>
+      </w:pPr>
+      <w:r>
+        <w:t xml:space="preserve">Sau đó làm tiếp mục 3.3 để đồng bộ lần đầu.</w:t>
+      </w:r>
+    </w:p>
+    <w:p>
+      <w:pPr>
+        <w:pBdr>
+          <w:left w:val="single" w:color="C55A11" w:sz="24" w:space="8"/>
+        </w:pBdr>
+        <w:shd w:fill="FFF4E5" w:color="auto" w:val="clear"/>
+        <w:spacing w:before="120" w:after="200"/>
+        <w:ind w:left="170" w:right="170"/>
+      </w:pPr>
+      <w:r>
+        <w:rPr>
+          <w:b/>
+          <w:bCs/>
+          <w:color w:val="C55A11"/>
+        </w:rPr>
+        <w:t xml:space="preserve">Lưu ý: </w:t>
+      </w:r>
+      <w:r>
         <w:rPr>
           <w:rFonts w:ascii="Consolas" w:cs="Consolas" w:eastAsia="Consolas" w:hAnsi="Consolas"/>
           <w:color w:val="7A2E0E"/>
@@ -2858,49 +3255,40 @@
           <w:sz w:val="19"/>
           <w:szCs w:val="19"/>
         </w:rPr>
+        <w:t xml:space="preserve">git pull</w:t>
+      </w:r>
+      <w:r>
+        <w:t xml:space="preserve">. Mỗi bản clone chỉ cần bật một lần; cách A đã bật sẵn.</w:t>
+      </w:r>
+    </w:p>
+    <w:p>
+      <w:pPr>
+        <w:pStyle w:val="Heading2"/>
+      </w:pPr>
+      <w:bookmarkStart w:name="_Sec6" w:id="1"/>
+      <w:r>
+        <w:t xml:space="preserve">3.3. Đồng bộ lần đầu (chỉ khi clone theo cách B)</w:t>
+      </w:r>
+      <w:bookmarkEnd w:id="1"/>
+    </w:p>
+    <w:p>
+      <w:pPr>
+        <w:spacing w:after="120"/>
+      </w:pPr>
+      <w:r>
+        <w:t xml:space="preserve">Chỉ cần làm nếu clone theo cách B; cách A đã tự đồng bộ. </w:t>
+      </w:r>
+      <w:r>
+        <w:rPr>
+          <w:rFonts w:ascii="Consolas" w:cs="Consolas" w:eastAsia="Consolas" w:hAnsi="Consolas"/>
+          <w:color w:val="7A2E0E"/>
+          <w:sz w:val="19"/>
+          <w:szCs w:val="19"/>
+        </w:rPr>
         <w:t xml:space="preserve">git clone</w:t>
       </w:r>
       <w:r>
-        <w:t xml:space="preserve"> hay </w:t>
-      </w:r>
-      <w:r>
-        <w:rPr>
-          <w:rFonts w:ascii="Consolas" w:cs="Consolas" w:eastAsia="Consolas" w:hAnsi="Consolas"/>
-          <w:color w:val="7A2E0E"/>
-          <w:sz w:val="19"/>
-          <w:szCs w:val="19"/>
-        </w:rPr>
-        <w:t xml:space="preserve">git pull</w:t>
-      </w:r>
-      <w:r>
-        <w:t xml:space="preserve">. Mỗi máy, mỗi bản clone phải chạy lệnh này một lần.</w:t>
-      </w:r>
-    </w:p>
-    <w:p>
-      <w:pPr>
-        <w:pStyle w:val="Heading2"/>
-      </w:pPr>
-      <w:bookmarkStart w:name="_Sec6" w:id="1"/>
-      <w:r>
-        <w:t xml:space="preserve">3.3. Đồng bộ lần đầu</w:t>
-      </w:r>
-      <w:bookmarkEnd w:id="1"/>
-    </w:p>
-    <w:p>
-      <w:pPr>
-        <w:spacing w:after="120"/>
-      </w:pPr>
-      <w:r>
-        <w:rPr>
-          <w:rFonts w:ascii="Consolas" w:cs="Consolas" w:eastAsia="Consolas" w:hAnsi="Consolas"/>
-          <w:color w:val="7A2E0E"/>
-          <w:sz w:val="19"/>
-          <w:szCs w:val="19"/>
-        </w:rPr>
-        <w:t xml:space="preserve">git clone</w:t>
-      </w:r>
-      <w:r>
-        <w:t xml:space="preserve"> không kích hoạt hook, nên cần chạy sync thủ công lần đầu:</w:t>
+        <w:t xml:space="preserve"> thường không chạy hook nên phải chạy sync thủ công một lần:</w:t>
       </w:r>
     </w:p>
     <w:p>
@@ -2969,6 +3357,38 @@
     </w:p>
     <w:p>
       <w:pPr>
+        <w:spacing w:after="120"/>
+      </w:pPr>
+      <w:r>
+        <w:t xml:space="preserve">Về sau, mỗi lần </w:t>
+      </w:r>
+      <w:r>
+        <w:rPr>
+          <w:rFonts w:ascii="Consolas" w:cs="Consolas" w:eastAsia="Consolas" w:hAnsi="Consolas"/>
+          <w:color w:val="7A2E0E"/>
+          <w:sz w:val="19"/>
+          <w:szCs w:val="19"/>
+        </w:rPr>
+        <w:t xml:space="preserve">git pull</w:t>
+      </w:r>
+      <w:r>
+        <w:t xml:space="preserve"> kéo về commit mới thì hook tự chạy sync. Pull báo </w:t>
+      </w:r>
+      <w:r>
+        <w:rPr>
+          <w:rFonts w:ascii="Consolas" w:cs="Consolas" w:eastAsia="Consolas" w:hAnsi="Consolas"/>
+          <w:color w:val="7A2E0E"/>
+          <w:sz w:val="19"/>
+          <w:szCs w:val="19"/>
+        </w:rPr>
+        <w:t xml:space="preserve">Already up to date</w:t>
+      </w:r>
+      <w:r>
+        <w:t xml:space="preserve"> thì không hook nào chạy, vì không có gì cần đồng bộ.</w:t>
+      </w:r>
+    </w:p>
+    <w:p>
+      <w:pPr>
         <w:pStyle w:val="Heading2"/>
       </w:pPr>
       <w:bookmarkStart w:name="_Sec7" w:id="1"/>
@@ -2994,7 +3414,7 @@
         <w:t xml:space="preserve">%USERPROFILE%\.claude\CLAUDE.md</w:t>
       </w:r>
       <w:r>
-        <w:t xml:space="preserve"> bằng tay. Bước 3.3 đã ghi vào đó một khối như sau (đường dẫn là nơi bạn clone repository, danh sách Skill lấy từ </w:t>
+        <w:t xml:space="preserve"> bằng tay. Bước đồng bộ lần đầu (cách A ở mục 3.2, hoặc mục 3.3) đã ghi vào đó một khối như sau (đường dẫn là nơi bạn clone repository, danh sách Skill lấy từ </w:t>
       </w:r>
       <w:r>
         <w:rPr>
@@ -3742,6 +4162,24 @@
           <w:sz w:val="18"/>
           <w:szCs w:val="18"/>
         </w:rPr>
+        <w:t xml:space="preserve">git hook run post-checkout -- 0000000000000000000000000000000000000000 HEAD 1</w:t>
+      </w:r>
+    </w:p>
+    <w:p>
+      <w:pPr>
+        <w:pBdr>
+          <w:left w:val="single" w:color="9CA3AF" w:sz="12" w:space="6"/>
+        </w:pBdr>
+        <w:shd w:fill="F3F4F6" w:color="auto" w:val="clear"/>
+        <w:spacing w:before="0" w:after="0" w:line="260"/>
+        <w:ind w:left="170"/>
+      </w:pPr>
+      <w:r>
+        <w:rPr>
+          <w:rFonts w:ascii="Consolas" w:cs="Consolas" w:eastAsia="Consolas" w:hAnsi="Consolas"/>
+          <w:sz w:val="18"/>
+          <w:szCs w:val="18"/>
+        </w:rPr>
         <w:t xml:space="preserve">git hook run post-merge</w:t>
       </w:r>
     </w:p>
@@ -3769,7 +4207,7 @@
         <w:spacing w:after="120"/>
       </w:pPr>
       <w:r>
-        <w:t xml:space="preserve">Cả hai lệnh </w:t>
+        <w:t xml:space="preserve">Cả ba lệnh </w:t>
       </w:r>
       <w:r>
         <w:rPr>
@@ -4664,6 +5102,18 @@
         <w:t xml:space="preserve">post-rewrite</w:t>
       </w:r>
       <w:r>
+        <w:t xml:space="preserve"> nếu máy có commit local chưa push; nếu không có commit local, Git fast-forward và chạy </w:t>
+      </w:r>
+      <w:r>
+        <w:rPr>
+          <w:rFonts w:ascii="Consolas" w:cs="Consolas" w:eastAsia="Consolas" w:hAnsi="Consolas"/>
+          <w:color w:val="7A2E0E"/>
+          <w:sz w:val="19"/>
+          <w:szCs w:val="19"/>
+        </w:rPr>
+        <w:t xml:space="preserve">post-merge</w:t>
+      </w:r>
+      <w:r>
         <w:t xml:space="preserve">).</w:t>
       </w:r>
     </w:p>
@@ -4689,19 +5139,19 @@
         <w:t xml:space="preserve">git.rebaseWhenSync</w:t>
       </w:r>
       <w:r>
-        <w:t xml:space="preserve">, VS Code pull bằng rebase và hook </w:t>
-      </w:r>
-      <w:r>
-        <w:rPr>
-          <w:rFonts w:ascii="Consolas" w:cs="Consolas" w:eastAsia="Consolas" w:hAnsi="Consolas"/>
-          <w:color w:val="7A2E0E"/>
-          <w:sz w:val="19"/>
-          <w:szCs w:val="19"/>
-        </w:rPr>
-        <w:t xml:space="preserve">post-rewrite</w:t>
-      </w:r>
-      <w:r>
-        <w:t xml:space="preserve"> được dùng.</w:t>
+        <w:t xml:space="preserve">, VS Code pull bằng rebase và hook chạy theo cùng quy tắc với </w:t>
+      </w:r>
+      <w:r>
+        <w:rPr>
+          <w:rFonts w:ascii="Consolas" w:cs="Consolas" w:eastAsia="Consolas" w:hAnsi="Consolas"/>
+          <w:color w:val="7A2E0E"/>
+          <w:sz w:val="19"/>
+          <w:szCs w:val="19"/>
+        </w:rPr>
+        <w:t xml:space="preserve">git pull --rebase</w:t>
+      </w:r>
+      <w:r>
+        <w:t xml:space="preserve"> ở trên.</w:t>
       </w:r>
     </w:p>
     <w:p>
@@ -4710,6 +5160,26 @@
       </w:pPr>
       <w:r>
         <w:t xml:space="preserve">Log của hook trong VS Code xem tại View → Output, chọn kênh Git.</w:t>
+      </w:r>
+    </w:p>
+    <w:p>
+      <w:pPr>
+        <w:spacing w:after="120"/>
+      </w:pPr>
+      <w:r>
+        <w:t xml:space="preserve">Pull báo </w:t>
+      </w:r>
+      <w:r>
+        <w:rPr>
+          <w:rFonts w:ascii="Consolas" w:cs="Consolas" w:eastAsia="Consolas" w:hAnsi="Consolas"/>
+          <w:color w:val="7A2E0E"/>
+          <w:sz w:val="19"/>
+          <w:szCs w:val="19"/>
+        </w:rPr>
+        <w:t xml:space="preserve">Already up to date</w:t>
+      </w:r>
+      <w:r>
+        <w:t xml:space="preserve"> thì không hook nào chạy. Đây là hành vi bình thường.</w:t>
       </w:r>
     </w:p>
     <w:p>
@@ -4826,7 +5296,19 @@
         <w:t xml:space="preserve">git switch</w:t>
       </w:r>
       <w:r>
-        <w:t xml:space="preserve"> không kích hoạt hook. Nếu nhánh mới thêm hoặc xóa Skill, hoặc có template CLAUDE.md khác, chạy </w:t>
+        <w:t xml:space="preserve"> có gọi hook </w:t>
+      </w:r>
+      <w:r>
+        <w:rPr>
+          <w:rFonts w:ascii="Consolas" w:cs="Consolas" w:eastAsia="Consolas" w:hAnsi="Consolas"/>
+          <w:color w:val="7A2E0E"/>
+          <w:sz w:val="19"/>
+          <w:szCs w:val="19"/>
+        </w:rPr>
+        <w:t xml:space="preserve">post-checkout</w:t>
+      </w:r>
+      <w:r>
+        <w:t xml:space="preserve">, nhưng hook này chỉ đồng bộ khi clone nên đổi nhánh không chạy sync. Nếu nhánh mới thêm hoặc xóa Skill, hoặc có template CLAUDE.md khác, chạy </w:t>
       </w:r>
       <w:r>
         <w:rPr>
@@ -5191,6 +5673,52 @@
           </w:tcPr>
           <w:p>
             <w:r>
+              <w:t xml:space="preserve">Clone</w:t>
+            </w:r>
+          </w:p>
+        </w:tc>
+        <w:tc>
+          <w:tcPr>
+            <w:tcW w:type="dxa" w:w="5238"/>
+            <w:tcBorders>
+              <w:top w:val="single" w:color="BFBFBF" w:sz="4"/>
+              <w:left w:val="single" w:color="BFBFBF" w:sz="4"/>
+              <w:bottom w:val="single" w:color="BFBFBF" w:sz="4"/>
+              <w:right w:val="single" w:color="BFBFBF" w:sz="4"/>
+            </w:tcBorders>
+            <w:tcMar>
+              <w:top w:type="dxa" w:w="60"/>
+              <w:left w:type="dxa" w:w="100"/>
+              <w:bottom w:type="dxa" w:w="60"/>
+              <w:right w:type="dxa" w:w="100"/>
+            </w:tcMar>
+          </w:tcPr>
+          <w:p>
+            <w:r>
+              <w:t xml:space="preserve">Không tự bật hook. Sau khi clone, làm theo mục 3.2 cách B và mục 3.3</w:t>
+            </w:r>
+          </w:p>
+        </w:tc>
+      </w:tr>
+      <w:tr>
+        <w:tc>
+          <w:tcPr>
+            <w:tcW w:type="dxa" w:w="4400"/>
+            <w:tcBorders>
+              <w:top w:val="single" w:color="BFBFBF" w:sz="4"/>
+              <w:left w:val="single" w:color="BFBFBF" w:sz="4"/>
+              <w:bottom w:val="single" w:color="BFBFBF" w:sz="4"/>
+              <w:right w:val="single" w:color="BFBFBF" w:sz="4"/>
+            </w:tcBorders>
+            <w:tcMar>
+              <w:top w:type="dxa" w:w="60"/>
+              <w:left w:type="dxa" w:w="100"/>
+              <w:bottom w:type="dxa" w:w="60"/>
+              <w:right w:type="dxa" w:w="100"/>
+            </w:tcMar>
+          </w:tcPr>
+          <w:p>
+            <w:r>
               <w:t xml:space="preserve">Switch/Checkout</w:t>
             </w:r>
           </w:p>
@@ -5213,7 +5741,7 @@
           </w:tcPr>
           <w:p>
             <w:r>
-              <w:t xml:space="preserve">Không — giống CLI</w:t>
+              <w:t xml:space="preserve">Không sync — giống CLI (mục 4.6)</w:t>
             </w:r>
           </w:p>
         </w:tc>
@@ -7529,7 +8057,19 @@
         <w:t xml:space="preserve">html-injection-xss.md</w:t>
       </w:r>
       <w:r>
-        <w:t xml:space="preserve"> (HTML injection, hyperlink injection, XSS — CWE-79, CWE-80). Danh sách đầy đủ ở </w:t>
+        <w:t xml:space="preserve"> (HTML injection, hyperlink injection, XSS — CWE-79, CWE-80) và </w:t>
+      </w:r>
+      <w:r>
+        <w:rPr>
+          <w:rFonts w:ascii="Consolas" w:cs="Consolas" w:eastAsia="Consolas" w:hAnsi="Consolas"/>
+          <w:color w:val="7A2E0E"/>
+          <w:sz w:val="19"/>
+          <w:szCs w:val="19"/>
+        </w:rPr>
+        <w:t xml:space="preserve">rate-limiting.md</w:t>
+      </w:r>
+      <w:r>
+        <w:t xml:space="preserve"> (lack of rate limiting, brute force, OTP brute force, email bombing, resource exhaustion — CWE-307, CWE-770). Danh sách đầy đủ ở </w:t>
       </w:r>
       <w:r>
         <w:rPr>
@@ -7666,6 +8206,138 @@
       </w:r>
       <w:r>
         <w:t xml:space="preserve">. Việc này vô hại vì sync là idempotent.</w:t>
+      </w:r>
+    </w:p>
+    <w:p>
+      <w:pPr>
+        <w:pStyle w:val="ListParagraph"/>
+        <w:numPr>
+          <w:ilvl w:val="0"/>
+          <w:numId w:val="2"/>
+        </w:numPr>
+        <w:spacing w:after="60"/>
+      </w:pPr>
+      <w:r>
+        <w:rPr>
+          <w:rFonts w:ascii="Consolas" w:cs="Consolas" w:eastAsia="Consolas" w:hAnsi="Consolas"/>
+          <w:color w:val="7A2E0E"/>
+          <w:sz w:val="19"/>
+          <w:szCs w:val="19"/>
+        </w:rPr>
+        <w:t xml:space="preserve">post-checkout</w:t>
+      </w:r>
+      <w:r>
+        <w:t xml:space="preserve"> được Git gọi sau mỗi lần </w:t>
+      </w:r>
+      <w:r>
+        <w:rPr>
+          <w:rFonts w:ascii="Consolas" w:cs="Consolas" w:eastAsia="Consolas" w:hAnsi="Consolas"/>
+          <w:color w:val="7A2E0E"/>
+          <w:sz w:val="19"/>
+          <w:szCs w:val="19"/>
+        </w:rPr>
+        <w:t xml:space="preserve">git checkout</w:t>
+      </w:r>
+      <w:r>
+        <w:t xml:space="preserve"> / </w:t>
+      </w:r>
+      <w:r>
+        <w:rPr>
+          <w:rFonts w:ascii="Consolas" w:cs="Consolas" w:eastAsia="Consolas" w:hAnsi="Consolas"/>
+          <w:color w:val="7A2E0E"/>
+          <w:sz w:val="19"/>
+          <w:szCs w:val="19"/>
+        </w:rPr>
+        <w:t xml:space="preserve">git switch</w:t>
+      </w:r>
+      <w:r>
+        <w:t xml:space="preserve">, nhưng chỉ chạy sync khi ref cũ là null-sha, tức là lần checkout đầu tiên của </w:t>
+      </w:r>
+      <w:r>
+        <w:rPr>
+          <w:rFonts w:ascii="Consolas" w:cs="Consolas" w:eastAsia="Consolas" w:hAnsi="Consolas"/>
+          <w:color w:val="7A2E0E"/>
+          <w:sz w:val="19"/>
+          <w:szCs w:val="19"/>
+        </w:rPr>
+        <w:t xml:space="preserve">git clone</w:t>
+      </w:r>
+      <w:r>
+        <w:t xml:space="preserve">. Đổi nhánh không chạy sync.</w:t>
+      </w:r>
+    </w:p>
+    <w:p>
+      <w:pPr>
+        <w:pStyle w:val="ListParagraph"/>
+        <w:numPr>
+          <w:ilvl w:val="0"/>
+          <w:numId w:val="2"/>
+        </w:numPr>
+        <w:spacing w:after="60"/>
+      </w:pPr>
+      <w:r>
+        <w:t xml:space="preserve">Hook chỉ chạy lúc clone khi clone có </w:t>
+      </w:r>
+      <w:r>
+        <w:rPr>
+          <w:rFonts w:ascii="Consolas" w:cs="Consolas" w:eastAsia="Consolas" w:hAnsi="Consolas"/>
+          <w:color w:val="7A2E0E"/>
+          <w:sz w:val="19"/>
+          <w:szCs w:val="19"/>
+        </w:rPr>
+        <w:t xml:space="preserve">-c core.hooksPath=.githooks</w:t>
+      </w:r>
+      <w:r>
+        <w:t xml:space="preserve"> (mục 3.2 cách A). Không có cách nào để </w:t>
+      </w:r>
+      <w:r>
+        <w:rPr>
+          <w:rFonts w:ascii="Consolas" w:cs="Consolas" w:eastAsia="Consolas" w:hAnsi="Consolas"/>
+          <w:color w:val="7A2E0E"/>
+          <w:sz w:val="19"/>
+          <w:szCs w:val="19"/>
+        </w:rPr>
+        <w:t xml:space="preserve">git clone</w:t>
+      </w:r>
+      <w:r>
+        <w:t xml:space="preserve"> thường tự chạy hook của repository.</w:t>
+      </w:r>
+    </w:p>
+    <w:p>
+      <w:pPr>
+        <w:pStyle w:val="ListParagraph"/>
+        <w:numPr>
+          <w:ilvl w:val="0"/>
+          <w:numId w:val="2"/>
+        </w:numPr>
+        <w:spacing w:after="60"/>
+      </w:pPr>
+      <w:r>
+        <w:t xml:space="preserve">File trong </w:t>
+      </w:r>
+      <w:r>
+        <w:rPr>
+          <w:rFonts w:ascii="Consolas" w:cs="Consolas" w:eastAsia="Consolas" w:hAnsi="Consolas"/>
+          <w:color w:val="7A2E0E"/>
+          <w:sz w:val="19"/>
+          <w:szCs w:val="19"/>
+        </w:rPr>
+        <w:t xml:space="preserve">.githooks/</w:t>
+      </w:r>
+      <w:r>
+        <w:t xml:space="preserve"> luôn được checkout với xuống dòng LF nhờ </w:t>
+      </w:r>
+      <w:r>
+        <w:rPr>
+          <w:rFonts w:ascii="Consolas" w:cs="Consolas" w:eastAsia="Consolas" w:hAnsi="Consolas"/>
+          <w:color w:val="7A2E0E"/>
+          <w:sz w:val="19"/>
+          <w:szCs w:val="19"/>
+        </w:rPr>
+        <w:t xml:space="preserve">.gitattributes</w:t>
+      </w:r>
+      <w:r>
+        <w:t xml:space="preserve">. Không đổi các file này sang CRLF.</w:t>
       </w:r>
     </w:p>
     <w:p>
@@ -7978,6 +8650,95 @@
           </w:tcPr>
           <w:p>
             <w:r>
+              <w:t xml:space="preserve">Clone xong nhưng không có Junction và không có </w:t>
+            </w:r>
+            <w:r>
+              <w:rPr>
+                <w:rFonts w:ascii="Consolas" w:cs="Consolas" w:eastAsia="Consolas" w:hAnsi="Consolas"/>
+                <w:color w:val="7A2E0E"/>
+                <w:sz w:val="19"/>
+                <w:szCs w:val="19"/>
+              </w:rPr>
+              <w:t xml:space="preserve">CLAUDE.md</w:t>
+            </w:r>
+            <w:r>
+              <w:t xml:space="preserve"> toàn cục</w:t>
+            </w:r>
+          </w:p>
+        </w:tc>
+        <w:tc>
+          <w:tcPr>
+            <w:tcW w:type="dxa" w:w="3238"/>
+            <w:tcBorders>
+              <w:top w:val="single" w:color="BFBFBF" w:sz="4"/>
+              <w:left w:val="single" w:color="BFBFBF" w:sz="4"/>
+              <w:bottom w:val="single" w:color="BFBFBF" w:sz="4"/>
+              <w:right w:val="single" w:color="BFBFBF" w:sz="4"/>
+            </w:tcBorders>
+            <w:tcMar>
+              <w:top w:type="dxa" w:w="60"/>
+              <w:left w:type="dxa" w:w="100"/>
+              <w:bottom w:type="dxa" w:w="60"/>
+              <w:right w:type="dxa" w:w="100"/>
+            </w:tcMar>
+          </w:tcPr>
+          <w:p>
+            <w:r>
+              <w:t xml:space="preserve">Clone bằng lệnh thường, thiếu </w:t>
+            </w:r>
+            <w:r>
+              <w:rPr>
+                <w:rFonts w:ascii="Consolas" w:cs="Consolas" w:eastAsia="Consolas" w:hAnsi="Consolas"/>
+                <w:color w:val="7A2E0E"/>
+                <w:sz w:val="19"/>
+                <w:szCs w:val="19"/>
+              </w:rPr>
+              <w:t xml:space="preserve">-c core.hooksPath=.githooks</w:t>
+            </w:r>
+          </w:p>
+        </w:tc>
+        <w:tc>
+          <w:tcPr>
+            <w:tcW w:type="dxa" w:w="3300"/>
+            <w:tcBorders>
+              <w:top w:val="single" w:color="BFBFBF" w:sz="4"/>
+              <w:left w:val="single" w:color="BFBFBF" w:sz="4"/>
+              <w:bottom w:val="single" w:color="BFBFBF" w:sz="4"/>
+              <w:right w:val="single" w:color="BFBFBF" w:sz="4"/>
+            </w:tcBorders>
+            <w:tcMar>
+              <w:top w:type="dxa" w:w="60"/>
+              <w:left w:type="dxa" w:w="100"/>
+              <w:bottom w:type="dxa" w:w="60"/>
+              <w:right w:type="dxa" w:w="100"/>
+            </w:tcMar>
+          </w:tcPr>
+          <w:p>
+            <w:r>
+              <w:t xml:space="preserve">Làm mục 3.2 cách B, rồi mục 3.3</w:t>
+            </w:r>
+          </w:p>
+        </w:tc>
+      </w:tr>
+      <w:tr>
+        <w:tc>
+          <w:tcPr>
+            <w:tcW w:type="dxa" w:w="3100"/>
+            <w:tcBorders>
+              <w:top w:val="single" w:color="BFBFBF" w:sz="4"/>
+              <w:left w:val="single" w:color="BFBFBF" w:sz="4"/>
+              <w:bottom w:val="single" w:color="BFBFBF" w:sz="4"/>
+              <w:right w:val="single" w:color="BFBFBF" w:sz="4"/>
+            </w:tcBorders>
+            <w:tcMar>
+              <w:top w:type="dxa" w:w="60"/>
+              <w:left w:type="dxa" w:w="100"/>
+              <w:bottom w:type="dxa" w:w="60"/>
+              <w:right w:type="dxa" w:w="100"/>
+            </w:tcMar>
+          </w:tcPr>
+          <w:p>
+            <w:r>
               <w:t xml:space="preserve">Pull xong nhưng Skill mới không có Junction</w:t>
             </w:r>
           </w:p>
@@ -9021,6 +9782,24 @@
           <w:sz w:val="18"/>
           <w:szCs w:val="18"/>
         </w:rPr>
+        <w:t xml:space="preserve">Test-Path ".githooks\post-checkout"</w:t>
+      </w:r>
+    </w:p>
+    <w:p>
+      <w:pPr>
+        <w:pBdr>
+          <w:left w:val="single" w:color="9CA3AF" w:sz="12" w:space="6"/>
+        </w:pBdr>
+        <w:shd w:fill="F3F4F6" w:color="auto" w:val="clear"/>
+        <w:spacing w:before="0" w:after="0" w:line="260"/>
+        <w:ind w:left="170"/>
+      </w:pPr>
+      <w:r>
+        <w:rPr>
+          <w:rFonts w:ascii="Consolas" w:cs="Consolas" w:eastAsia="Consolas" w:hAnsi="Consolas"/>
+          <w:sz w:val="18"/>
+          <w:szCs w:val="18"/>
+        </w:rPr>
         <w:t xml:space="preserve">Test-Path ".githooks\post-rewrite"</w:t>
       </w:r>
     </w:p>
@@ -9207,6 +9986,205 @@
           <w:szCs w:val="18"/>
         </w:rPr>
         <w:t xml:space="preserve">#!/bin/sh</w:t>
+      </w:r>
+    </w:p>
+    <w:p>
+      <w:pPr>
+        <w:pBdr>
+          <w:left w:val="single" w:color="9CA3AF" w:sz="12" w:space="6"/>
+        </w:pBdr>
+        <w:shd w:fill="F3F4F6" w:color="auto" w:val="clear"/>
+        <w:spacing w:before="0" w:after="0" w:line="260"/>
+        <w:ind w:left="170"/>
+      </w:pPr>
+      <w:r>
+        <w:rPr>
+          <w:rFonts w:ascii="Consolas" w:cs="Consolas" w:eastAsia="Consolas" w:hAnsi="Consolas"/>
+          <w:sz w:val="18"/>
+          <w:szCs w:val="18"/>
+        </w:rPr>
+        <w:t xml:space="preserve"> </w:t>
+      </w:r>
+    </w:p>
+    <w:p>
+      <w:pPr>
+        <w:pBdr>
+          <w:left w:val="single" w:color="9CA3AF" w:sz="12" w:space="6"/>
+        </w:pBdr>
+        <w:shd w:fill="F3F4F6" w:color="auto" w:val="clear"/>
+        <w:spacing w:before="0" w:after="0" w:line="260"/>
+        <w:ind w:left="170"/>
+      </w:pPr>
+      <w:r>
+        <w:rPr>
+          <w:rFonts w:ascii="Consolas" w:cs="Consolas" w:eastAsia="Consolas" w:hAnsi="Consolas"/>
+          <w:sz w:val="18"/>
+          <w:szCs w:val="18"/>
+        </w:rPr>
+        <w:t xml:space="preserve">REPO_ROOT="$(git rev-parse --show-toplevel)" || exit 1</w:t>
+      </w:r>
+    </w:p>
+    <w:p>
+      <w:pPr>
+        <w:pBdr>
+          <w:left w:val="single" w:color="9CA3AF" w:sz="12" w:space="6"/>
+        </w:pBdr>
+        <w:shd w:fill="F3F4F6" w:color="auto" w:val="clear"/>
+        <w:spacing w:before="0" w:after="0" w:line="260"/>
+        <w:ind w:left="170"/>
+      </w:pPr>
+      <w:r>
+        <w:rPr>
+          <w:rFonts w:ascii="Consolas" w:cs="Consolas" w:eastAsia="Consolas" w:hAnsi="Consolas"/>
+          <w:sz w:val="18"/>
+          <w:szCs w:val="18"/>
+        </w:rPr>
+        <w:t xml:space="preserve"> </w:t>
+      </w:r>
+    </w:p>
+    <w:p>
+      <w:pPr>
+        <w:pBdr>
+          <w:left w:val="single" w:color="9CA3AF" w:sz="12" w:space="6"/>
+        </w:pBdr>
+        <w:shd w:fill="F3F4F6" w:color="auto" w:val="clear"/>
+        <w:spacing w:before="0" w:after="0" w:line="260"/>
+        <w:ind w:left="170"/>
+      </w:pPr>
+      <w:r>
+        <w:rPr>
+          <w:rFonts w:ascii="Consolas" w:cs="Consolas" w:eastAsia="Consolas" w:hAnsi="Consolas"/>
+          <w:sz w:val="18"/>
+          <w:szCs w:val="18"/>
+        </w:rPr>
+        <w:t xml:space="preserve">powershell.exe -NoProfile -ExecutionPolicy Bypass \</w:t>
+      </w:r>
+    </w:p>
+    <w:p>
+      <w:pPr>
+        <w:pBdr>
+          <w:left w:val="single" w:color="9CA3AF" w:sz="12" w:space="6"/>
+        </w:pBdr>
+        <w:shd w:fill="F3F4F6" w:color="auto" w:val="clear"/>
+        <w:spacing w:before="0" w:after="0" w:line="260"/>
+        <w:ind w:left="170"/>
+      </w:pPr>
+      <w:r>
+        <w:rPr>
+          <w:rFonts w:ascii="Consolas" w:cs="Consolas" w:eastAsia="Consolas" w:hAnsi="Consolas"/>
+          <w:sz w:val="18"/>
+          <w:szCs w:val="18"/>
+        </w:rPr>
+        <w:t xml:space="preserve">  -File "$REPO_ROOT/scripts/sync-skills.ps1"</w:t>
+      </w:r>
+    </w:p>
+    <w:p>
+      <w:pPr>
+        <w:pBdr>
+          <w:left w:val="single" w:color="9CA3AF" w:sz="12" w:space="6"/>
+        </w:pBdr>
+        <w:shd w:fill="F3F4F6" w:color="auto" w:val="clear"/>
+        <w:spacing w:before="0" w:after="0" w:line="260"/>
+        <w:ind w:left="170"/>
+      </w:pPr>
+      <w:r>
+        <w:rPr>
+          <w:rFonts w:ascii="Consolas" w:cs="Consolas" w:eastAsia="Consolas" w:hAnsi="Consolas"/>
+          <w:sz w:val="18"/>
+          <w:szCs w:val="18"/>
+        </w:rPr>
+        <w:t xml:space="preserve"> </w:t>
+      </w:r>
+    </w:p>
+    <w:p>
+      <w:pPr>
+        <w:pBdr>
+          <w:bottom w:val="single" w:color="F3F4F6" w:sz="2" w:space="2"/>
+          <w:left w:val="single" w:color="9CA3AF" w:sz="12" w:space="6"/>
+        </w:pBdr>
+        <w:shd w:fill="F3F4F6" w:color="auto" w:val="clear"/>
+        <w:spacing w:before="0" w:after="160" w:line="260"/>
+        <w:ind w:left="170"/>
+      </w:pPr>
+      <w:r>
+        <w:rPr>
+          <w:rFonts w:ascii="Consolas" w:cs="Consolas" w:eastAsia="Consolas" w:hAnsi="Consolas"/>
+          <w:sz w:val="18"/>
+          <w:szCs w:val="18"/>
+        </w:rPr>
+        <w:t xml:space="preserve">exit $?</w:t>
+      </w:r>
+    </w:p>
+    <w:p>
+      <w:pPr>
+        <w:spacing w:after="120"/>
+      </w:pPr>
+      <w:r>
+        <w:rPr>
+          <w:rFonts w:ascii="Consolas" w:cs="Consolas" w:eastAsia="Consolas" w:hAnsi="Consolas"/>
+          <w:color w:val="7A2E0E"/>
+          <w:sz w:val="19"/>
+          <w:szCs w:val="19"/>
+        </w:rPr>
+        <w:t xml:space="preserve">.githooks/post-checkout</w:t>
+      </w:r>
+      <w:r>
+        <w:t xml:space="preserve"> có thêm một dòng kiểm tra để chỉ chạy sync khi clone (ref cũ là null-sha):</w:t>
+      </w:r>
+    </w:p>
+    <w:p>
+      <w:pPr>
+        <w:pBdr>
+          <w:top w:val="single" w:color="F3F4F6" w:sz="2" w:space="2"/>
+          <w:left w:val="single" w:color="9CA3AF" w:sz="12" w:space="6"/>
+        </w:pBdr>
+        <w:shd w:fill="F3F4F6" w:color="auto" w:val="clear"/>
+        <w:spacing w:before="0" w:after="0" w:line="260"/>
+        <w:ind w:left="170"/>
+      </w:pPr>
+      <w:r>
+        <w:rPr>
+          <w:rFonts w:ascii="Consolas" w:cs="Consolas" w:eastAsia="Consolas" w:hAnsi="Consolas"/>
+          <w:sz w:val="18"/>
+          <w:szCs w:val="18"/>
+        </w:rPr>
+        <w:t xml:space="preserve">#!/bin/sh</w:t>
+      </w:r>
+    </w:p>
+    <w:p>
+      <w:pPr>
+        <w:pBdr>
+          <w:left w:val="single" w:color="9CA3AF" w:sz="12" w:space="6"/>
+        </w:pBdr>
+        <w:shd w:fill="F3F4F6" w:color="auto" w:val="clear"/>
+        <w:spacing w:before="0" w:after="0" w:line="260"/>
+        <w:ind w:left="170"/>
+      </w:pPr>
+      <w:r>
+        <w:rPr>
+          <w:rFonts w:ascii="Consolas" w:cs="Consolas" w:eastAsia="Consolas" w:hAnsi="Consolas"/>
+          <w:sz w:val="18"/>
+          <w:szCs w:val="18"/>
+        </w:rPr>
+        <w:t xml:space="preserve"> </w:t>
+      </w:r>
+    </w:p>
+    <w:p>
+      <w:pPr>
+        <w:pBdr>
+          <w:left w:val="single" w:color="9CA3AF" w:sz="12" w:space="6"/>
+        </w:pBdr>
+        <w:shd w:fill="F3F4F6" w:color="auto" w:val="clear"/>
+        <w:spacing w:before="0" w:after="0" w:line="260"/>
+        <w:ind w:left="170"/>
+      </w:pPr>
+      <w:r>
+        <w:rPr>
+          <w:rFonts w:ascii="Consolas" w:cs="Consolas" w:eastAsia="Consolas" w:hAnsi="Consolas"/>
+          <w:sz w:val="18"/>
+          <w:szCs w:val="18"/>
+        </w:rPr>
+        <w:t xml:space="preserve">[ "$1" = "0000000000000000000000000000000000000000" ] || exit 0</w:t>
       </w:r>
     </w:p>
     <w:p>

</xml_diff>